<commit_message>
feat: round 21 deliverables - machine receipt of round 20 baked in + Chinese usage section (docx 9 sections / pptx 8 slides)
Co-authored-by: arena-agent <297053741+arena-agent@users.noreply.github.com>
</commit_message>
<xml_diff>
--- a/deliverable/LINK_PROOF_v2.8.1.docx
+++ b/deliverable/LINK_PROOF_v2.8.1.docx
@@ -661,10 +661,114 @@
         <w:t>the sandbox never claims success on its own: the verdict has to come back through git</w:t>
       </w:r>
     </w:p>
+    <w:p>
+      <w:pPr>
+        <w:pStyle w:val="Heading1"/>
+      </w:pPr>
+      <w:r>
+        <w:t>7. 本机回执（round 20，已通过）</w:t>
+      </w:r>
+    </w:p>
+    <w:p>
+      <w:pPr>
+        <w:pStyle w:val="ListBullet"/>
+      </w:pPr>
+      <w:r>
+        <w:t>round 20 在你本机（LAPTOP-R77M5D6M）判定：passed（exit 0，用时 21 秒）</w:t>
+      </w:r>
+    </w:p>
+    <w:p>
+      <w:pPr>
+        <w:pStyle w:val="ListBullet"/>
+      </w:pPr>
+      <w:r>
+        <w:t>3a-3g：两个产物的 sha256/字节、OOXML 必需部件、XML 解析、关系不断链、内容类型、标记词、页数（6 &gt;= 6）全部 OK</w:t>
+      </w:r>
+    </w:p>
+    <w:p>
+      <w:pPr>
+        <w:pStyle w:val="ListBullet"/>
+      </w:pPr>
+      <w:r>
+        <w:t>3h：真 Word.Application 只读打开 LINK_PROOF_v2.8.1.docx；真 PowerPoint.Application 只读打开 LINK_PROOF_v2.8.1.pptx（6 页）</w:t>
+      </w:r>
+    </w:p>
+    <w:p>
+      <w:pPr>
+        <w:pStyle w:val="ListBullet"/>
+      </w:pPr>
+      <w:r>
+        <w:t>闸门：本机用真 PowerShell 解析器逐个解析 .ps1（沙箱只能 SKIP 这一步）</w:t>
+      </w:r>
+    </w:p>
+    <w:p>
+      <w:pPr>
+        <w:pStyle w:val="ListBullet"/>
+      </w:pPr>
+      <w:r>
+        <w:t>完整日志：results/status/check_r20_20260916-192634.txt（本机推回本分支）</w:t>
+      </w:r>
+    </w:p>
+    <w:p>
+      <w:pPr>
+        <w:pStyle w:val="Heading1"/>
+      </w:pPr>
+      <w:r>
+        <w:t>8. 中文说明：这条链路怎么用</w:t>
+      </w:r>
+    </w:p>
+    <w:p>
+      <w:pPr>
+        <w:pStyle w:val="ListBullet"/>
+      </w:pPr>
+      <w:r>
+        <w:t>链路：Arena 会话（沙箱）↔ 你的 Windows 本机，中间只有 git；本机侧就是一个计划任务值守。</w:t>
+      </w:r>
+    </w:p>
+    <w:p>
+      <w:pPr>
+        <w:pStyle w:val="ListBullet"/>
+      </w:pPr>
+      <w:r>
+        <w:t>本机只做一次：新文件夹 clone → .\bootstrap.ps1 -Auto（注册值守 + 配好免点击推送）。之后不用手动 sync/push。</w:t>
+      </w:r>
+    </w:p>
+    <w:p>
+      <w:pPr>
+        <w:pStyle w:val="ListBullet"/>
+      </w:pPr>
+      <w:r>
+        <w:t>值守每 2 分钟一轮：自动 pull → 跑 code\local_check.ps1 → 把 passed/failed 与完整日志推回本分支。</w:t>
+      </w:r>
+    </w:p>
+    <w:p>
+      <w:pPr>
+        <w:pStyle w:val="ListBullet"/>
+      </w:pPr>
+      <w:r>
+        <w:t>取交付物：.\download.ps1 -Set final（镜像到 ..\&lt;仓库名&gt;_out\），或直接打开本仓库的 deliverable 目录。</w:t>
+      </w:r>
+    </w:p>
+    <w:p>
+      <w:pPr>
+        <w:pStyle w:val="ListBullet"/>
+      </w:pPr>
+      <w:r>
+        <w:t>看结论：results/status/handshake.json（round / arena_state / local_state）+ results/status/check_rN_*.txt（每轮日志）。</w:t>
+      </w:r>
+    </w:p>
+    <w:p>
+      <w:pPr>
+        <w:pStyle w:val="ListBullet"/>
+      </w:pPr>
+      <w:r>
+        <w:t>切回本会话值守：cd E:\0github\git-sync\git-pull-arena-01a0a9f0 ; .\watch.ps1 -Focus；恢复其他会话：.\watch.ps1 -RestoreParked。</w:t>
+      </w:r>
+    </w:p>
     <w:p/>
     <w:p>
       <w:r>
-        <w:t>markers: 2.8.1 , git-sync , local_check.ps1 , LAPTOP-R77M5D6M , arena/01a0a9f0-git-pull-arena</w:t>
+        <w:t>markers: 2.8.1 , git-sync , local_check.ps1 , round 20 , LAPTOP-R77M5D6M , arena/01a0a9f0-git-pull-arena</w:t>
       </w:r>
     </w:p>
     <w:sectPr>

</xml_diff>